<commit_message>
updated lab10 to be published with vercel
</commit_message>
<xml_diff>
--- a/SEG3125-lab10-Group05/SEG 3125 Lab 10.docx
+++ b/SEG3125-lab10-Group05/SEG 3125 Lab 10.docx
@@ -140,7 +140,31 @@
         <w:t xml:space="preserve">Contribution percentage: </w:t>
       </w:r>
       <w:r>
-        <w:t>1/3 by Ahmed Salma (), 1/3 by Sahara Sammy (), 1/3 by Steven Feng Peng ()</w:t>
+        <w:t>1/3 by Ahmed Salma (</w:t>
+      </w:r>
+      <w:r>
+        <w:t>created the video demonstrating the results of the chatbot on the website, created the Entities for the chatbot to retrieve correct data</w:t>
+      </w:r>
+      <w:r>
+        <w:t>), 1/3 by Sahara Sammy (</w:t>
+      </w:r>
+      <w:r>
+        <w:t>provided the flow and general context of the website to the chatbot</w:t>
+      </w:r>
+      <w:r>
+        <w:t>), 1/3 by Steven Feng Peng (</w:t>
+      </w:r>
+      <w:r>
+        <w:t>i</w:t>
+      </w:r>
+      <w:r>
+        <w:t>ntegrated the chatbot Rebike into the website through the HTML snippet</w:t>
+      </w:r>
+      <w:r>
+        <w:t>, defined the actions and context with Python for the chatbot’s behavior, made the PDF document</w:t>
+      </w:r>
+      <w:r>
+        <w:t>)</w:t>
       </w:r>
     </w:p>
     <w:p>
@@ -165,23 +189,6 @@
         </w:rPr>
         <w:t xml:space="preserve"> </w:t>
       </w:r>
-      <w:hyperlink r:id="rId6" w:history="1">
-        <w:r>
-          <w:rPr>
-            <w:rStyle w:val="Hyperlink"/>
-            <w:b/>
-            <w:bCs/>
-          </w:rPr>
-          <w:t>https://sammysahara.github.io/cycler-forever/</w:t>
-        </w:r>
-      </w:hyperlink>
-      <w:r>
-        <w:rPr>
-          <w:b/>
-          <w:bCs/>
-        </w:rPr>
-        <w:t xml:space="preserve"> </w:t>
-      </w:r>
     </w:p>
     <w:p>
       <w:pPr>
@@ -219,70 +226,204 @@
     </w:p>
     <w:p>
       <w:pPr>
-        <w:jc w:val="center"/>
-        <w:rPr>
-          <w:b/>
-          <w:bCs/>
-        </w:rPr>
-      </w:pPr>
+        <w:rPr>
+          <w:b/>
+          <w:bCs/>
+        </w:rPr>
+      </w:pPr>
+      <w:r>
+        <w:rPr>
+          <w:b/>
+          <w:bCs/>
+        </w:rPr>
+        <w:drawing>
+          <wp:inline distT="0" distB="0" distL="0" distR="0" wp14:anchorId="600E37E9" wp14:editId="75F0AA7E">
+            <wp:extent cx="5667770" cy="2857500"/>
+            <wp:effectExtent l="0" t="0" r="9525" b="0"/>
+            <wp:docPr id="610715030" name="Picture 1"/>
+            <wp:cNvGraphicFramePr>
+              <a:graphicFrameLocks xmlns:a="http://schemas.openxmlformats.org/drawingml/2006/main" noChangeAspect="1"/>
+            </wp:cNvGraphicFramePr>
+            <a:graphic xmlns:a="http://schemas.openxmlformats.org/drawingml/2006/main">
+              <a:graphicData uri="http://schemas.openxmlformats.org/drawingml/2006/picture">
+                <pic:pic xmlns:pic="http://schemas.openxmlformats.org/drawingml/2006/picture">
+                  <pic:nvPicPr>
+                    <pic:cNvPr id="610715030" name=""/>
+                    <pic:cNvPicPr/>
+                  </pic:nvPicPr>
+                  <pic:blipFill>
+                    <a:blip r:embed="rId6"/>
+                    <a:stretch>
+                      <a:fillRect/>
+                    </a:stretch>
+                  </pic:blipFill>
+                  <pic:spPr>
+                    <a:xfrm>
+                      <a:off x="0" y="0"/>
+                      <a:ext cx="5671883" cy="2859574"/>
+                    </a:xfrm>
+                    <a:prstGeom prst="rect">
+                      <a:avLst/>
+                    </a:prstGeom>
+                  </pic:spPr>
+                </pic:pic>
+              </a:graphicData>
+            </a:graphic>
+          </wp:inline>
+        </w:drawing>
+      </w:r>
     </w:p>
     <w:p>
       <w:pPr>
-        <w:jc w:val="center"/>
-        <w:rPr>
-          <w:b/>
-          <w:bCs/>
-        </w:rPr>
-      </w:pPr>
+        <w:rPr>
+          <w:b/>
+          <w:bCs/>
+        </w:rPr>
+      </w:pPr>
+      <w:r>
+        <w:rPr>
+          <w:b/>
+          <w:bCs/>
+        </w:rPr>
+        <w:lastRenderedPageBreak/>
+        <w:drawing>
+          <wp:inline distT="0" distB="0" distL="0" distR="0" wp14:anchorId="329E4B7D" wp14:editId="315D025C">
+            <wp:extent cx="5743575" cy="2882219"/>
+            <wp:effectExtent l="0" t="0" r="0" b="0"/>
+            <wp:docPr id="1078641978" name="Picture 1"/>
+            <wp:cNvGraphicFramePr>
+              <a:graphicFrameLocks xmlns:a="http://schemas.openxmlformats.org/drawingml/2006/main" noChangeAspect="1"/>
+            </wp:cNvGraphicFramePr>
+            <a:graphic xmlns:a="http://schemas.openxmlformats.org/drawingml/2006/main">
+              <a:graphicData uri="http://schemas.openxmlformats.org/drawingml/2006/picture">
+                <pic:pic xmlns:pic="http://schemas.openxmlformats.org/drawingml/2006/picture">
+                  <pic:nvPicPr>
+                    <pic:cNvPr id="1078641978" name=""/>
+                    <pic:cNvPicPr/>
+                  </pic:nvPicPr>
+                  <pic:blipFill>
+                    <a:blip r:embed="rId7"/>
+                    <a:stretch>
+                      <a:fillRect/>
+                    </a:stretch>
+                  </pic:blipFill>
+                  <pic:spPr>
+                    <a:xfrm>
+                      <a:off x="0" y="0"/>
+                      <a:ext cx="5752785" cy="2886841"/>
+                    </a:xfrm>
+                    <a:prstGeom prst="rect">
+                      <a:avLst/>
+                    </a:prstGeom>
+                  </pic:spPr>
+                </pic:pic>
+              </a:graphicData>
+            </a:graphic>
+          </wp:inline>
+        </w:drawing>
+      </w:r>
     </w:p>
     <w:p>
       <w:pPr>
-        <w:jc w:val="center"/>
-        <w:rPr>
-          <w:b/>
-          <w:bCs/>
-        </w:rPr>
-      </w:pPr>
+        <w:rPr>
+          <w:b/>
+          <w:bCs/>
+        </w:rPr>
+      </w:pPr>
+      <w:r>
+        <w:rPr>
+          <w:b/>
+          <w:bCs/>
+        </w:rPr>
+        <w:drawing>
+          <wp:inline distT="0" distB="0" distL="0" distR="0" wp14:anchorId="2C80C84D" wp14:editId="2D8BBA76">
+            <wp:extent cx="5943600" cy="2978150"/>
+            <wp:effectExtent l="0" t="0" r="0" b="0"/>
+            <wp:docPr id="1602278242" name="Picture 1"/>
+            <wp:cNvGraphicFramePr>
+              <a:graphicFrameLocks xmlns:a="http://schemas.openxmlformats.org/drawingml/2006/main" noChangeAspect="1"/>
+            </wp:cNvGraphicFramePr>
+            <a:graphic xmlns:a="http://schemas.openxmlformats.org/drawingml/2006/main">
+              <a:graphicData uri="http://schemas.openxmlformats.org/drawingml/2006/picture">
+                <pic:pic xmlns:pic="http://schemas.openxmlformats.org/drawingml/2006/picture">
+                  <pic:nvPicPr>
+                    <pic:cNvPr id="1602278242" name=""/>
+                    <pic:cNvPicPr/>
+                  </pic:nvPicPr>
+                  <pic:blipFill>
+                    <a:blip r:embed="rId8"/>
+                    <a:stretch>
+                      <a:fillRect/>
+                    </a:stretch>
+                  </pic:blipFill>
+                  <pic:spPr>
+                    <a:xfrm>
+                      <a:off x="0" y="0"/>
+                      <a:ext cx="5943600" cy="2978150"/>
+                    </a:xfrm>
+                    <a:prstGeom prst="rect">
+                      <a:avLst/>
+                    </a:prstGeom>
+                  </pic:spPr>
+                </pic:pic>
+              </a:graphicData>
+            </a:graphic>
+          </wp:inline>
+        </w:drawing>
+      </w:r>
     </w:p>
     <w:p>
       <w:pPr>
-        <w:jc w:val="center"/>
-        <w:rPr>
-          <w:b/>
-          <w:bCs/>
-        </w:rPr>
-      </w:pPr>
+        <w:rPr>
+          <w:b/>
+          <w:bCs/>
+        </w:rPr>
+      </w:pPr>
+      <w:r>
+        <w:rPr>
+          <w:b/>
+          <w:bCs/>
+        </w:rPr>
+        <w:lastRenderedPageBreak/>
+        <w:drawing>
+          <wp:inline distT="0" distB="0" distL="0" distR="0" wp14:anchorId="6F6450EB" wp14:editId="1163C8EF">
+            <wp:extent cx="5943600" cy="2970530"/>
+            <wp:effectExtent l="0" t="0" r="0" b="1270"/>
+            <wp:docPr id="1652844320" name="Picture 1"/>
+            <wp:cNvGraphicFramePr>
+              <a:graphicFrameLocks xmlns:a="http://schemas.openxmlformats.org/drawingml/2006/main" noChangeAspect="1"/>
+            </wp:cNvGraphicFramePr>
+            <a:graphic xmlns:a="http://schemas.openxmlformats.org/drawingml/2006/main">
+              <a:graphicData uri="http://schemas.openxmlformats.org/drawingml/2006/picture">
+                <pic:pic xmlns:pic="http://schemas.openxmlformats.org/drawingml/2006/picture">
+                  <pic:nvPicPr>
+                    <pic:cNvPr id="1652844320" name=""/>
+                    <pic:cNvPicPr/>
+                  </pic:nvPicPr>
+                  <pic:blipFill>
+                    <a:blip r:embed="rId9"/>
+                    <a:stretch>
+                      <a:fillRect/>
+                    </a:stretch>
+                  </pic:blipFill>
+                  <pic:spPr>
+                    <a:xfrm>
+                      <a:off x="0" y="0"/>
+                      <a:ext cx="5943600" cy="2970530"/>
+                    </a:xfrm>
+                    <a:prstGeom prst="rect">
+                      <a:avLst/>
+                    </a:prstGeom>
+                  </pic:spPr>
+                </pic:pic>
+              </a:graphicData>
+            </a:graphic>
+          </wp:inline>
+        </w:drawing>
+      </w:r>
     </w:p>
     <w:p>
       <w:pPr>
-        <w:jc w:val="center"/>
-        <w:rPr>
-          <w:b/>
-          <w:bCs/>
-        </w:rPr>
-      </w:pPr>
-    </w:p>
-    <w:p>
-      <w:pPr>
-        <w:jc w:val="center"/>
-        <w:rPr>
-          <w:b/>
-          <w:bCs/>
-        </w:rPr>
-      </w:pPr>
-    </w:p>
-    <w:p>
-      <w:pPr>
-        <w:jc w:val="center"/>
-        <w:rPr>
-          <w:b/>
-          <w:bCs/>
-        </w:rPr>
-      </w:pPr>
-    </w:p>
-    <w:p>
-      <w:pPr>
-        <w:jc w:val="center"/>
         <w:rPr>
           <w:b/>
           <w:bCs/>
@@ -308,13 +449,6 @@
           <w:bCs/>
         </w:rPr>
       </w:pPr>
-      <w:r>
-        <w:rPr>
-          <w:b/>
-          <w:bCs/>
-        </w:rPr>
-        <w:tab/>
-      </w:r>
     </w:p>
     <w:sectPr>
       <w:pgSz w:w="12240" w:h="15840"/>

</xml_diff>

<commit_message>
updated the word doc and pdf
</commit_message>
<xml_diff>
--- a/SEG3125-lab10-Group05/SEG 3125 Lab 10.docx
+++ b/SEG3125-lab10-Group05/SEG 3125 Lab 10.docx
@@ -93,6 +93,23 @@
         </w:rPr>
         <w:t xml:space="preserve"> </w:t>
       </w:r>
+      <w:hyperlink r:id="rId5" w:history="1">
+        <w:r>
+          <w:rPr>
+            <w:rStyle w:val="Hyperlink"/>
+            <w:b/>
+            <w:bCs/>
+          </w:rPr>
+          <w:t>https://github.com/SEG3125-2026/SEG--LAB10--GROUP05</w:t>
+        </w:r>
+      </w:hyperlink>
+      <w:r>
+        <w:rPr>
+          <w:b/>
+          <w:bCs/>
+        </w:rPr>
+        <w:t xml:space="preserve"> </w:t>
+      </w:r>
     </w:p>
     <w:p>
       <w:pPr>
@@ -113,7 +130,7 @@
         </w:rPr>
         <w:t xml:space="preserve">Link to the personal GitHub repository: </w:t>
       </w:r>
-      <w:hyperlink r:id="rId5" w:history="1">
+      <w:hyperlink r:id="rId6" w:history="1">
         <w:r>
           <w:rPr>
             <w:rStyle w:val="Hyperlink"/>
@@ -158,7 +175,15 @@
         <w:t>i</w:t>
       </w:r>
       <w:r>
-        <w:t>ntegrated the chatbot Rebike into the website through the HTML snippet</w:t>
+        <w:t xml:space="preserve">ntegrated the chatbot </w:t>
+      </w:r>
+      <w:proofErr w:type="spellStart"/>
+      <w:r>
+        <w:t>Rebike</w:t>
+      </w:r>
+      <w:proofErr w:type="spellEnd"/>
+      <w:r>
+        <w:t xml:space="preserve"> into the website through the HTML snippet</w:t>
       </w:r>
       <w:r>
         <w:t>, defined the actions and context with Python for the chatbot’s behavior, made the PDF document</w:t>
@@ -189,6 +214,23 @@
         </w:rPr>
         <w:t xml:space="preserve"> </w:t>
       </w:r>
+      <w:hyperlink r:id="rId7" w:history="1">
+        <w:r>
+          <w:rPr>
+            <w:rStyle w:val="Hyperlink"/>
+            <w:b/>
+            <w:bCs/>
+          </w:rPr>
+          <w:t>https://cyclerforever.vercel.app/</w:t>
+        </w:r>
+      </w:hyperlink>
+      <w:r>
+        <w:rPr>
+          <w:b/>
+          <w:bCs/>
+        </w:rPr>
+        <w:t xml:space="preserve"> </w:t>
+      </w:r>
     </w:p>
     <w:p>
       <w:pPr>
@@ -222,6 +264,13 @@
           <w:bCs/>
         </w:rPr>
         <w:t>:</w:t>
+      </w:r>
+      <w:r>
+        <w:rPr>
+          <w:b/>
+          <w:bCs/>
+        </w:rPr>
+        <w:t xml:space="preserve"> </w:t>
       </w:r>
     </w:p>
     <w:p>
@@ -252,7 +301,7 @@
                     <pic:cNvPicPr/>
                   </pic:nvPicPr>
                   <pic:blipFill>
-                    <a:blip r:embed="rId6"/>
+                    <a:blip r:embed="rId8"/>
                     <a:stretch>
                       <a:fillRect/>
                     </a:stretch>
@@ -302,7 +351,7 @@
                     <pic:cNvPicPr/>
                   </pic:nvPicPr>
                   <pic:blipFill>
-                    <a:blip r:embed="rId7"/>
+                    <a:blip r:embed="rId9"/>
                     <a:stretch>
                       <a:fillRect/>
                     </a:stretch>
@@ -351,7 +400,7 @@
                     <pic:cNvPicPr/>
                   </pic:nvPicPr>
                   <pic:blipFill>
-                    <a:blip r:embed="rId8"/>
+                    <a:blip r:embed="rId10"/>
                     <a:stretch>
                       <a:fillRect/>
                     </a:stretch>
@@ -401,7 +450,7 @@
                     <pic:cNvPicPr/>
                   </pic:nvPicPr>
                   <pic:blipFill>
-                    <a:blip r:embed="rId9"/>
+                    <a:blip r:embed="rId11"/>
                     <a:stretch>
                       <a:fillRect/>
                     </a:stretch>

</xml_diff>